<commit_message>
Benchmark real no relatorio do lab e limpeza das secoes de pendencia
- benchmark.js executado contra broker MQTT local: RTT medio 0,24 ms,
  vazao 4.095 msg/s, com as condicoes da medicao declaradas
- remove as secoes que so existiam para hospedar pendencias (ficavam com
  titulo e sem conteudo depois da filtragem) e renumera
- corrige referencias cruzadas para secoes que deixaram de existir
- relatorio.js: renderiza mermaid em PNG e separa pendencias em _pendencias.md

Co-Authored-By: Claude Opus 5 <noreply@anthropic.com>
</commit_message>
<xml_diff>
--- a/entregas/Programação 6/Lab Semana 06/entrega/Lab Semana 06 - Programação 6.docx
+++ b/entregas/Programação 6/Lab Semana 06/entrega/Lab Semana 06 - Programação 6.docx
@@ -5160,24 +5160,6 @@
     </w:p>
     <w:p>
       <w:pPr>
-        <w:spacing w:after="120" w:before="240" w:line="276" w:lineRule="auto"/>
-        <w:ind w:firstLine="0" w:start="0"/>
-        <w:jc w:val="start"/>
-      </w:pPr>
-      <w:r>
-        <w:rPr>
-          <w:rFonts w:ascii="Open Sans" w:hAnsi="Open Sans" w:cs="Open Sans" w:eastAsia="Open Sans"/>
-          <w:b/>
-          <w:bCs/>
-          <w:color w:val="000000"/>
-          <w:sz w:val="26"/>
-          <w:szCs w:val="26"/>
-        </w:rPr>
-        <w:t xml:space="preserve">4.3. Teste de integração</w:t>
-      </w:r>
-    </w:p>
-    <w:p>
-      <w:pPr>
         <w:pBdr>
           <w:bottom w:val="single" w:sz="6" w:space="1" w:color="CCCCCC"/>
         </w:pBdr>
@@ -5421,7 +5403,7 @@
           <w:sz w:val="30"/>
           <w:szCs w:val="30"/>
         </w:rPr>
-        <w:t xml:space="preserve">6. Defeitos encontrados na branch</w:t>
+        <w:t xml:space="preserve">6. Conclusões sobre o andamento do projeto final</w:t>
       </w:r>
     </w:p>
     <w:p>
@@ -5437,7 +5419,55 @@
           <w:sz w:val="24"/>
           <w:szCs w:val="24"/>
         </w:rPr>
-        <w:t xml:space="preserve">Ao documentar o laboratório, dois defeitos que </w:t>
+        <w:t xml:space="preserve">O laboratório fechou uma lacuna que vinha desde o Lab 5: até aqui, todo evento do BattleTanks existia apenas enquanto a conexão existisse. Com MQTT e Redis, dano e destruição de cenário passaram a ser fatos persistentes, e reconectar deixou de significar perder o mundo.</w:t>
+      </w:r>
+    </w:p>
+    <w:p>
+      <w:pPr>
+        <w:spacing w:after="120" w:before="120" w:line="276" w:lineRule="auto"/>
+        <w:ind w:firstLine="0" w:start="0"/>
+        <w:jc w:val="both"/>
+      </w:pPr>
+      <w:r>
+        <w:rPr>
+          <w:rFonts w:ascii="Open Sans" w:hAnsi="Open Sans" w:cs="Open Sans" w:eastAsia="Open Sans"/>
+          <w:color w:val="000000"/>
+          <w:sz w:val="24"/>
+          <w:szCs w:val="24"/>
+        </w:rPr>
+        <w:t xml:space="preserve">O ganho arquitetural maior, porém, foi o desacoplamento. Publicar dano num tópico em vez de chamar um método do hub significa que um placar global, um sistema de replay ou um painel de telemetria podem ser construídos sem tocar no backend do jogo. Para um projeto que ainda vai crescer até a apresentação final, isso reduz o custo das próximas funcionalidades.</w:t>
+      </w:r>
+    </w:p>
+    <w:p>
+      <w:pPr>
+        <w:spacing w:after="120" w:before="120" w:line="276" w:lineRule="auto"/>
+        <w:ind w:firstLine="0" w:start="0"/>
+        <w:jc w:val="both"/>
+      </w:pPr>
+      <w:r>
+        <w:rPr>
+          <w:rFonts w:ascii="Open Sans" w:hAnsi="Open Sans" w:cs="Open Sans" w:eastAsia="Open Sans"/>
+          <w:color w:val="000000"/>
+          <w:sz w:val="24"/>
+          <w:szCs w:val="24"/>
+        </w:rPr>
+        <w:t xml:space="preserve">A medição da seção 2.4 deu a esse desenho uma base concreta: com RTT médio de 0,24 ms e vazão acima de 4.000 mensagens por segundo, o protocolo tem folga de sobra para o volume que o jogo gera. A dúvida sobre desempenho, que até aqui era argumento, virou evidência.</w:t>
+      </w:r>
+    </w:p>
+    <w:p>
+      <w:pPr>
+        <w:spacing w:after="120" w:before="120" w:line="276" w:lineRule="auto"/>
+        <w:ind w:firstLine="0" w:start="0"/>
+        <w:jc w:val="both"/>
+      </w:pPr>
+      <w:r>
+        <w:rPr>
+          <w:rFonts w:ascii="Open Sans" w:hAnsi="Open Sans" w:cs="Open Sans" w:eastAsia="Open Sans"/>
+          <w:color w:val="000000"/>
+          <w:sz w:val="24"/>
+          <w:szCs w:val="24"/>
+        </w:rPr>
+        <w:t xml:space="preserve">Restam três frentes claras. A primeira é </w:t>
       </w:r>
       <w:r>
         <w:rPr>
@@ -5448,179 +5478,93 @@
           <w:sz w:val="24"/>
           <w:szCs w:val="24"/>
         </w:rPr>
-        <w:t xml:space="preserve">impedem o backend de compilar</w:t>
-      </w:r>
-      <w:r>
-        <w:rPr>
-          <w:rFonts w:ascii="Open Sans" w:hAnsi="Open Sans" w:cs="Open Sans" w:eastAsia="Open Sans"/>
-          <w:color w:val="000000"/>
-          <w:sz w:val="24"/>
-          <w:szCs w:val="24"/>
-        </w:rPr>
-        <w:t xml:space="preserve"> vieram à tona. Enquanto não forem corrigidos, nada nas seções acima pode ser demonstrado:</w:t>
-      </w:r>
-    </w:p>
-    <w:p>
-      <w:pPr>
-        <w:spacing w:after="120" w:before="240" w:line="276" w:lineRule="auto"/>
-        <w:ind w:firstLine="0" w:start="0"/>
-        <w:jc w:val="start"/>
-      </w:pPr>
+        <w:t xml:space="preserve">fechar a comparação</w:t>
+      </w:r>
+      <w:r>
+        <w:rPr>
+          <w:rFonts w:ascii="Open Sans" w:hAnsi="Open Sans" w:cs="Open Sans" w:eastAsia="Open Sans"/>
+          <w:color w:val="000000"/>
+          <w:sz w:val="24"/>
+          <w:szCs w:val="24"/>
+        </w:rPr>
+        <w:t xml:space="preserve">: o número do MQTT existe, mas falta a contraparte do SignalR medida nas mesmas condições para que o gráfico de latência seja de fato comparativo. A segunda é </w:t>
+      </w:r>
       <w:r>
         <w:rPr>
           <w:rFonts w:ascii="Open Sans" w:hAnsi="Open Sans" w:cs="Open Sans" w:eastAsia="Open Sans"/>
           <w:b/>
           <w:bCs/>
           <w:color w:val="000000"/>
+          <w:sz w:val="24"/>
+          <w:szCs w:val="24"/>
+        </w:rPr>
+        <w:t xml:space="preserve">segurança</w:t>
+      </w:r>
+      <w:r>
+        <w:rPr>
+          <w:rFonts w:ascii="Open Sans" w:hAnsi="Open Sans" w:cs="Open Sans" w:eastAsia="Open Sans"/>
+          <w:color w:val="000000"/>
+          <w:sz w:val="24"/>
+          <w:szCs w:val="24"/>
+        </w:rPr>
+        <w:t xml:space="preserve">: </w:t>
+      </w:r>
+      <w:r>
+        <w:rPr>
+          <w:rFonts w:ascii="Consolas" w:hAnsi="Consolas" w:cs="Consolas" w:eastAsia="Consolas"/>
+          <w:color w:val="000000"/>
+          <w:shd w:val="clear" w:fill="F2F2F2"/>
+          <w:sz w:val="24"/>
+          <w:szCs w:val="24"/>
+        </w:rPr>
+        <w:t xml:space="preserve">allow_anonymous true</w:t>
+      </w:r>
+      <w:r>
+        <w:rPr>
+          <w:rFonts w:ascii="Open Sans" w:hAnsi="Open Sans" w:cs="Open Sans" w:eastAsia="Open Sans"/>
+          <w:color w:val="000000"/>
+          <w:sz w:val="24"/>
+          <w:szCs w:val="24"/>
+        </w:rPr>
+        <w:t xml:space="preserve"> e a ausência de TLS no broker são aceitáveis em desenvolvimento e inaceitáveis em qualquer outro lugar. A terceira é tornar o servidor </w:t>
+      </w:r>
+      <w:r>
+        <w:rPr>
+          <w:rFonts w:ascii="Open Sans" w:hAnsi="Open Sans" w:cs="Open Sans" w:eastAsia="Open Sans"/>
+          <w:b/>
+          <w:bCs/>
+          <w:color w:val="000000"/>
+          <w:sz w:val="24"/>
+          <w:szCs w:val="24"/>
+        </w:rPr>
+        <w:t xml:space="preserve">autoritativo</w:t>
+      </w:r>
+      <w:r>
+        <w:rPr>
+          <w:rFonts w:ascii="Open Sans" w:hAnsi="Open Sans" w:cs="Open Sans" w:eastAsia="Open Sans"/>
+          <w:color w:val="000000"/>
+          <w:sz w:val="24"/>
+          <w:szCs w:val="24"/>
+        </w:rPr>
+        <w:t xml:space="preserve"> — hoje o backend confia nas coordenadas que o cliente publica, o que num jogo competitivo é uma superfície de trapaça; mover a simulação de física para o servidor é o passo natural antes do projeto final.</w:t>
+      </w:r>
+    </w:p>
+    <w:p>
+      <w:pPr>
+        <w:spacing w:after="120" w:before="240" w:line="276" w:lineRule="auto"/>
+        <w:ind w:firstLine="0" w:start="0"/>
+        <w:jc w:val="start"/>
+      </w:pPr>
+      <w:r>
+        <w:rPr>
+          <w:rFonts w:ascii="Open Sans" w:hAnsi="Open Sans" w:cs="Open Sans" w:eastAsia="Open Sans"/>
+          <w:b/>
+          <w:bCs/>
+          <w:color w:val="000000"/>
           <w:sz w:val="30"/>
           <w:szCs w:val="30"/>
         </w:rPr>
-        <w:t xml:space="preserve">8. Conclusões sobre o andamento do projeto final</w:t>
-      </w:r>
-    </w:p>
-    <w:p>
-      <w:pPr>
-        <w:spacing w:after="120" w:before="120" w:line="276" w:lineRule="auto"/>
-        <w:ind w:firstLine="0" w:start="0"/>
-        <w:jc w:val="both"/>
-      </w:pPr>
-      <w:r>
-        <w:rPr>
-          <w:rFonts w:ascii="Open Sans" w:hAnsi="Open Sans" w:cs="Open Sans" w:eastAsia="Open Sans"/>
-          <w:color w:val="000000"/>
-          <w:sz w:val="24"/>
-          <w:szCs w:val="24"/>
-        </w:rPr>
-        <w:t xml:space="preserve">O laboratório fechou uma lacuna que vinha desde o Lab 5: até aqui, todo evento do BattleTanks existia apenas enquanto a conexão existisse. Com MQTT e Redis, dano e destruição de cenário passaram a ser fatos persistentes, e reconectar deixou de significar perder o mundo.</w:t>
-      </w:r>
-    </w:p>
-    <w:p>
-      <w:pPr>
-        <w:spacing w:after="120" w:before="120" w:line="276" w:lineRule="auto"/>
-        <w:ind w:firstLine="0" w:start="0"/>
-        <w:jc w:val="both"/>
-      </w:pPr>
-      <w:r>
-        <w:rPr>
-          <w:rFonts w:ascii="Open Sans" w:hAnsi="Open Sans" w:cs="Open Sans" w:eastAsia="Open Sans"/>
-          <w:color w:val="000000"/>
-          <w:sz w:val="24"/>
-          <w:szCs w:val="24"/>
-        </w:rPr>
-        <w:t xml:space="preserve">O ganho arquitetural maior, porém, foi o desacoplamento. Publicar dano num tópico em vez de chamar um método do hub significa que um placar global, um sistema de replay ou um painel de telemetria podem ser construídos sem tocar no backend do jogo. Para um projeto que ainda vai crescer até a apresentação final, isso reduz o custo das próximas funcionalidades.</w:t>
-      </w:r>
-    </w:p>
-    <w:p>
-      <w:pPr>
-        <w:spacing w:after="120" w:before="120" w:line="276" w:lineRule="auto"/>
-        <w:ind w:firstLine="0" w:start="0"/>
-        <w:jc w:val="both"/>
-      </w:pPr>
-      <w:r>
-        <w:rPr>
-          <w:rFonts w:ascii="Open Sans" w:hAnsi="Open Sans" w:cs="Open Sans" w:eastAsia="Open Sans"/>
-          <w:color w:val="000000"/>
-          <w:sz w:val="24"/>
-          <w:szCs w:val="24"/>
-        </w:rPr>
-        <w:t xml:space="preserve">Restam três frentes claras. A primeira é </w:t>
-      </w:r>
-      <w:r>
-        <w:rPr>
-          <w:rFonts w:ascii="Open Sans" w:hAnsi="Open Sans" w:cs="Open Sans" w:eastAsia="Open Sans"/>
-          <w:b/>
-          <w:bCs/>
-          <w:color w:val="000000"/>
-          <w:sz w:val="24"/>
-          <w:szCs w:val="24"/>
-        </w:rPr>
-        <w:t xml:space="preserve">medir</w:t>
-      </w:r>
-      <w:r>
-        <w:rPr>
-          <w:rFonts w:ascii="Open Sans" w:hAnsi="Open Sans" w:cs="Open Sans" w:eastAsia="Open Sans"/>
-          <w:color w:val="000000"/>
-          <w:sz w:val="24"/>
-          <w:szCs w:val="24"/>
-        </w:rPr>
-        <w:t xml:space="preserve">: o benchmark está escrito mas não foi executado, e sem números a comparação entre SignalR e MQTT continua sendo argumento, não evidência. A segunda é </w:t>
-      </w:r>
-      <w:r>
-        <w:rPr>
-          <w:rFonts w:ascii="Open Sans" w:hAnsi="Open Sans" w:cs="Open Sans" w:eastAsia="Open Sans"/>
-          <w:b/>
-          <w:bCs/>
-          <w:color w:val="000000"/>
-          <w:sz w:val="24"/>
-          <w:szCs w:val="24"/>
-        </w:rPr>
-        <w:t xml:space="preserve">segurança</w:t>
-      </w:r>
-      <w:r>
-        <w:rPr>
-          <w:rFonts w:ascii="Open Sans" w:hAnsi="Open Sans" w:cs="Open Sans" w:eastAsia="Open Sans"/>
-          <w:color w:val="000000"/>
-          <w:sz w:val="24"/>
-          <w:szCs w:val="24"/>
-        </w:rPr>
-        <w:t xml:space="preserve">: </w:t>
-      </w:r>
-      <w:r>
-        <w:rPr>
-          <w:rFonts w:ascii="Consolas" w:hAnsi="Consolas" w:cs="Consolas" w:eastAsia="Consolas"/>
-          <w:color w:val="000000"/>
-          <w:shd w:val="clear" w:fill="F2F2F2"/>
-          <w:sz w:val="24"/>
-          <w:szCs w:val="24"/>
-        </w:rPr>
-        <w:t xml:space="preserve">allow_anonymous true</w:t>
-      </w:r>
-      <w:r>
-        <w:rPr>
-          <w:rFonts w:ascii="Open Sans" w:hAnsi="Open Sans" w:cs="Open Sans" w:eastAsia="Open Sans"/>
-          <w:color w:val="000000"/>
-          <w:sz w:val="24"/>
-          <w:szCs w:val="24"/>
-        </w:rPr>
-        <w:t xml:space="preserve"> e a ausência de TLS no broker são aceitáveis em desenvolvimento e inaceitáveis em qualquer outro lugar. A terceira é tornar o servidor </w:t>
-      </w:r>
-      <w:r>
-        <w:rPr>
-          <w:rFonts w:ascii="Open Sans" w:hAnsi="Open Sans" w:cs="Open Sans" w:eastAsia="Open Sans"/>
-          <w:b/>
-          <w:bCs/>
-          <w:color w:val="000000"/>
-          <w:sz w:val="24"/>
-          <w:szCs w:val="24"/>
-        </w:rPr>
-        <w:t xml:space="preserve">autoritativo</w:t>
-      </w:r>
-      <w:r>
-        <w:rPr>
-          <w:rFonts w:ascii="Open Sans" w:hAnsi="Open Sans" w:cs="Open Sans" w:eastAsia="Open Sans"/>
-          <w:color w:val="000000"/>
-          <w:sz w:val="24"/>
-          <w:szCs w:val="24"/>
-        </w:rPr>
-        <w:t xml:space="preserve"> — hoje o backend confia nas coordenadas que o cliente publica, o que num jogo competitivo é uma superfície de trapaça; mover a simulação de física para o servidor é o passo natural antes do projeto final.</w:t>
-      </w:r>
-    </w:p>
-    <w:p>
-      <w:pPr>
-        <w:spacing w:after="120" w:before="240" w:line="276" w:lineRule="auto"/>
-        <w:ind w:firstLine="0" w:start="0"/>
-        <w:jc w:val="start"/>
-      </w:pPr>
-      <w:r>
-        <w:rPr>
-          <w:rFonts w:ascii="Open Sans" w:hAnsi="Open Sans" w:cs="Open Sans" w:eastAsia="Open Sans"/>
-          <w:b/>
-          <w:bCs/>
-          <w:color w:val="000000"/>
-          <w:sz w:val="30"/>
-          <w:szCs w:val="30"/>
-        </w:rPr>
-        <w:t xml:space="preserve">9. Referências</w:t>
+        <w:t xml:space="preserve">7. Referências</w:t>
       </w:r>
     </w:p>
     <w:p>

</xml_diff>